<commit_message>
Fix stale test count: 489 -> 492 everywhere
pytest currently collects 492 tests; the hero stat and the case-study
generator's N_TESTS constant were both still 489 from before the
502-handling fix added 3 tests. Docx regenerated from the corrected
constant.

Co-Authored-By: Claude Fable 5 <noreply@anthropic.com>
</commit_message>
<xml_diff>
--- a/deliverables/Supply_Chain_Copilot_Case_Study.docx
+++ b/deliverables/Supply_Chain_Copilot_Case_Study.docx
@@ -239,7 +239,7 @@
                 <w:color w:val="FFFFFF"/>
                 <w:sz w:val="40"/>
               </w:rPr>
-              <w:t>489</w:t>
+              <w:t>492</w:t>
             </w:r>
           </w:p>
           <w:p>
@@ -540,7 +540,7 @@
                 <w:color w:val="1A1F28"/>
                 <w:sz w:val="19"/>
               </w:rPr>
-              <w:t>489 automated tests, fixtures verified by hand</w:t>
+              <w:t>492 automated tests, fixtures verified by hand</w:t>
             </w:r>
           </w:p>
         </w:tc>
@@ -1736,7 +1736,7 @@
           <w:color w:val="1A1F28"/>
           <w:sz w:val="18"/>
         </w:rPr>
-        <w:t>Python, FastAPI, DuckDB, Pydantic, Claude, Next.js, Recharts, Tailwind.  Verified by 489 passing tests.</w:t>
+        <w:t>Python, FastAPI, DuckDB, Pydantic, Claude, Next.js, Recharts, Tailwind.  Verified by 492 passing tests.</w:t>
       </w:r>
     </w:p>
     <w:tbl>

</xml_diff>